<commit_message>
Update site styles, structure, and application logic with new contract document
Replit-Commit-Author: Agent
</commit_message>
<xml_diff>
--- a/templates/working/Договор_реклама.docx
+++ b/templates/working/Договор_реклама.docx
@@ -1,6 +1,6 @@
 
 <file path=word/document.xml><?xml version="1.0" encoding="utf-8"?>
-<w:document xmlns:wpc="http://schemas.microsoft.com/office/word/2010/wordprocessingCanvas" xmlns:cx="http://schemas.microsoft.com/office/drawing/2014/chartex" xmlns:cx1="http://schemas.microsoft.com/office/drawing/2015/9/8/chartex" xmlns:cx2="http://schemas.microsoft.com/office/drawing/2015/10/21/chartex" xmlns:cx3="http://schemas.microsoft.com/office/drawing/2016/5/9/chartex" xmlns:cx4="http://schemas.microsoft.com/office/drawing/2016/5/10/chartex" xmlns:cx5="http://schemas.microsoft.com/office/drawing/2016/5/11/chartex" xmlns:cx6="http://schemas.microsoft.com/office/drawing/2016/5/12/chartex" xmlns:cx7="http://schemas.microsoft.com/office/drawing/2016/5/13/chartex" xmlns:cx8="http://schemas.microsoft.com/office/drawing/2016/5/14/chartex" xmlns:mc="http://schemas.openxmlformats.org/markup-compatibility/2006" xmlns:aink="http://schemas.microsoft.com/office/drawing/2016/ink" xmlns:am3d="http://schemas.microsoft.com/office/drawing/2017/model3d" xmlns:o="urn:schemas-microsoft-com:office:office" xmlns:oel="http://schemas.microsoft.com/office/2019/extlst" xmlns:r="http://schemas.openxmlformats.org/officeDocument/2006/relationships" xmlns:m="http://schemas.openxmlformats.org/officeDocument/2006/math" xmlns:v="urn:schemas-microsoft-com:vml" xmlns:wp14="http://schemas.microsoft.com/office/word/2010/wordprocessingDrawing" xmlns:wp="http://schemas.openxmlformats.org/drawingml/2006/wordprocessingDrawing" xmlns:w10="urn:schemas-microsoft-com:office:word" xmlns:w="http://schemas.openxmlformats.org/wordprocessingml/2006/main" xmlns:w14="http://schemas.microsoft.com/office/word/2010/wordml" xmlns:w15="http://schemas.microsoft.com/office/word/2012/wordml" xmlns:w16cex="http://schemas.microsoft.com/office/word/2018/wordml/cex" xmlns:w16cid="http://schemas.microsoft.com/office/word/2016/wordml/cid" xmlns:w16="http://schemas.microsoft.com/office/word/2018/wordml" xmlns:w16du="http://schemas.microsoft.com/office/word/2023/wordml/word16du" xmlns:w16sdtdh="http://schemas.microsoft.com/office/word/2020/wordml/sdtdatahash" xmlns:w16sdtfl="http://schemas.microsoft.com/office/word/2024/wordml/sdtformatlock" xmlns:w16se="http://schemas.microsoft.com/office/word/2015/wordml/symex" xmlns:wpg="http://schemas.microsoft.com/office/word/2010/wordprocessingGroup" xmlns:wpi="http://schemas.microsoft.com/office/word/2010/wordprocessingInk" xmlns:wne="http://schemas.microsoft.com/office/word/2006/wordml" xmlns:wps="http://schemas.microsoft.com/office/word/2010/wordprocessingShape" mc:Ignorable="w14 w15 w16se w16cid w16 w16cex w16sdtdh w16sdtfl w16du wp14">
+<w:document xmlns:wpc="http://schemas.microsoft.com/office/word/2010/wordprocessingCanvas" xmlns:cx="http://schemas.microsoft.com/office/drawing/2014/chartex" xmlns:cx1="http://schemas.microsoft.com/office/drawing/2015/9/8/chartex" xmlns:cx2="http://schemas.microsoft.com/office/drawing/2015/10/21/chartex" xmlns:cx3="http://schemas.microsoft.com/office/drawing/2016/5/9/chartex" xmlns:cx4="http://schemas.microsoft.com/office/drawing/2016/5/10/chartex" xmlns:cx5="http://schemas.microsoft.com/office/drawing/2016/5/11/chartex" xmlns:cx6="http://schemas.microsoft.com/office/drawing/2016/5/12/chartex" xmlns:cx7="http://schemas.microsoft.com/office/drawing/2016/5/13/chartex" xmlns:cx8="http://schemas.microsoft.com/office/drawing/2016/5/14/chartex" xmlns:mc="http://schemas.openxmlformats.org/markup-compatibility/2006" xmlns:aink="http://schemas.microsoft.com/office/drawing/2016/ink" xmlns:am3d="http://schemas.microsoft.com/office/drawing/2017/model3d" xmlns:o="urn:schemas-microsoft-com:office:office" xmlns:r="http://schemas.openxmlformats.org/officeDocument/2006/relationships" xmlns:m="http://schemas.openxmlformats.org/officeDocument/2006/math" xmlns:v="urn:schemas-microsoft-com:vml" xmlns:wp14="http://schemas.microsoft.com/office/word/2010/wordprocessingDrawing" xmlns:wp="http://schemas.openxmlformats.org/drawingml/2006/wordprocessingDrawing" xmlns:w10="urn:schemas-microsoft-com:office:word" xmlns:w="http://schemas.openxmlformats.org/wordprocessingml/2006/main" xmlns:w14="http://schemas.microsoft.com/office/word/2010/wordml" xmlns:w15="http://schemas.microsoft.com/office/word/2012/wordml" xmlns:w16cex="http://schemas.microsoft.com/office/word/2018/wordml/cex" xmlns:w16cid="http://schemas.microsoft.com/office/word/2016/wordml/cid" xmlns:w16="http://schemas.microsoft.com/office/word/2018/wordml" xmlns:w16sdtdh="http://schemas.microsoft.com/office/word/2020/wordml/sdtdatahash" xmlns:w16se="http://schemas.microsoft.com/office/word/2015/wordml/symex" xmlns:wpg="http://schemas.microsoft.com/office/word/2010/wordprocessingGroup" xmlns:wpi="http://schemas.microsoft.com/office/word/2010/wordprocessingInk" xmlns:wne="http://schemas.microsoft.com/office/word/2006/wordml" xmlns:wps="http://schemas.microsoft.com/office/word/2010/wordprocessingShape" mc:Ignorable="w14 w15 w16se w16cid w16 w16cex w16sdtdh wp14">
   <w:body>
     <w:p>
       <w:pPr>
@@ -22,7 +22,17 @@
           <w:sz w:val="24"/>
           <w:szCs w:val="24"/>
         </w:rPr>
-        <w:t>ДОГОВОР № {{deal</w:t>
+        <w:t>ДОГОВОР № {{</w:t>
+      </w:r>
+      <w:r>
+        <w:rPr>
+          <w:rFonts w:ascii="Times New Roman" w:hAnsi="Times New Roman"/>
+          <w:b/>
+          <w:bCs/>
+          <w:sz w:val="24"/>
+          <w:szCs w:val="24"/>
+        </w:rPr>
+        <w:t>deal</w:t>
       </w:r>
       <w:r>
         <w:rPr>
@@ -54,13 +64,9 @@
           <w:sz w:val="24"/>
           <w:szCs w:val="24"/>
         </w:rPr>
-        <w:t>umber}}</w:t>
-      </w:r>
-    </w:p>
-    <w:p>
-      <w:pPr>
-        <w:pStyle w:val="ad"/>
-        <w:jc w:val="center"/>
+        <w:t>umber</w:t>
+      </w:r>
+      <w:r>
         <w:rPr>
           <w:rFonts w:ascii="Times New Roman" w:hAnsi="Times New Roman"/>
           <w:b/>
@@ -68,8 +74,13 @@
           <w:sz w:val="24"/>
           <w:szCs w:val="24"/>
         </w:rPr>
-      </w:pPr>
-      <w:r>
+        <w:t>}}</w:t>
+      </w:r>
+    </w:p>
+    <w:p>
+      <w:pPr>
+        <w:pStyle w:val="ad"/>
+        <w:jc w:val="center"/>
         <w:rPr>
           <w:rFonts w:ascii="Times New Roman" w:hAnsi="Times New Roman"/>
           <w:b/>
@@ -77,6 +88,15 @@
           <w:sz w:val="24"/>
           <w:szCs w:val="24"/>
         </w:rPr>
+      </w:pPr>
+      <w:r>
+        <w:rPr>
+          <w:rFonts w:ascii="Times New Roman" w:hAnsi="Times New Roman"/>
+          <w:b/>
+          <w:bCs/>
+          <w:sz w:val="24"/>
+          <w:szCs w:val="24"/>
+        </w:rPr>
         <w:t>на оказание рекламных услуг</w:t>
       </w:r>
     </w:p>
@@ -139,7 +159,15 @@
           <w:sz w:val="24"/>
           <w:szCs w:val="24"/>
         </w:rPr>
-        <w:t>{{deal.</w:t>
+        <w:t>{{</w:t>
+      </w:r>
+      <w:r>
+        <w:rPr>
+          <w:rFonts w:ascii="Times New Roman" w:hAnsi="Times New Roman"/>
+          <w:sz w:val="24"/>
+          <w:szCs w:val="24"/>
+        </w:rPr>
+        <w:t>deal.</w:t>
       </w:r>
       <w:r>
         <w:rPr>
@@ -184,7 +212,14 @@
           <w:rFonts w:ascii="Times New Roman" w:hAnsi="Times New Roman"/>
           <w:sz w:val="20"/>
         </w:rPr>
-        <w:t>{{seller</w:t>
+        <w:t>{{</w:t>
+      </w:r>
+      <w:r>
+        <w:rPr>
+          <w:rFonts w:ascii="Times New Roman" w:hAnsi="Times New Roman"/>
+          <w:sz w:val="20"/>
+        </w:rPr>
+        <w:t>seller</w:t>
       </w:r>
       <w:r>
         <w:rPr>
@@ -207,7 +242,14 @@
           <w:rFonts w:ascii="Times New Roman" w:hAnsi="Times New Roman"/>
           <w:sz w:val="20"/>
         </w:rPr>
-        <w:t>ullName}}</w:t>
+        <w:t>ullName</w:t>
+      </w:r>
+      <w:r>
+        <w:rPr>
+          <w:rFonts w:ascii="Times New Roman" w:hAnsi="Times New Roman"/>
+          <w:sz w:val="20"/>
+        </w:rPr>
+        <w:t>}}</w:t>
       </w:r>
       <w:r>
         <w:rPr>
@@ -353,7 +395,13 @@
         <w:rPr>
           <w:sz w:val="20"/>
         </w:rPr>
-        <w:t>ontractNumber}} от {{</w:t>
+        <w:t>ontractNumber</w:t>
+      </w:r>
+      <w:r>
+        <w:rPr>
+          <w:sz w:val="20"/>
+        </w:rPr>
+        <w:t>}} от {{</w:t>
       </w:r>
       <w:r>
         <w:rPr>
@@ -380,7 +428,13 @@
         <w:rPr>
           <w:sz w:val="20"/>
         </w:rPr>
-        <w:t xml:space="preserve">ontractDate}} обязуется по поручению Заказчика оказать услуги по созданию, изготовлению и размещению рекламных материалов в отношении объекта недвижимости </w:t>
+        <w:t>ontractDate</w:t>
+      </w:r>
+      <w:r>
+        <w:rPr>
+          <w:sz w:val="20"/>
+        </w:rPr>
+        <w:t xml:space="preserve">}} обязуется по поручению Заказчика оказать услуги по созданию, изготовлению и размещению рекламных материалов в отношении объекта недвижимости </w:t>
       </w:r>
       <w:r>
         <w:rPr>
@@ -431,7 +485,13 @@
         <w:rPr>
           <w:sz w:val="20"/>
         </w:rPr>
-        <w:t>, расположенного по адресу: {{property</w:t>
+        <w:t>, расположенного по адресу: {{</w:t>
+      </w:r>
+      <w:r>
+        <w:rPr>
+          <w:sz w:val="20"/>
+        </w:rPr>
+        <w:t>property</w:t>
       </w:r>
       <w:r>
         <w:rPr>
@@ -451,7 +511,13 @@
         <w:rPr>
           <w:sz w:val="20"/>
         </w:rPr>
-        <w:t>ddress}}, далее именуемые по тексту «Услуги» согласно прейскуранту (приложение № 1 к настоящему договору), а Заказчик обязуется принять Услуги, оказанные Исполнителем, и оплатить их в порядке и на условиях, определенных настоящим Договором.</w:t>
+        <w:t>ddress</w:t>
+      </w:r>
+      <w:r>
+        <w:rPr>
+          <w:sz w:val="20"/>
+        </w:rPr>
+        <w:t>}}, далее именуемые по тексту «Услуги» согласно прейскуранту (приложение № 1 к настоящему договору), а Заказчик обязуется принять Услуги, оказанные Исполнителем, и оплатить их в порядке и на условиях, определенных настоящим Договором.</w:t>
       </w:r>
     </w:p>
     <w:p>
@@ -1503,14 +1569,35 @@
           <w:color w:val="auto"/>
           <w:sz w:val="20"/>
         </w:rPr>
-        <w:t xml:space="preserve">7.2. Стороны безоговорочно соглашаются с тем, что вся переписка, извещения и уведомления, полученные на адреса электронной почты, а также мессенджеры (Viber, Telegram, </w:t>
-      </w:r>
-      <w:r>
-        <w:rPr>
-          <w:color w:val="auto"/>
-          <w:sz w:val="20"/>
-        </w:rPr>
-        <w:t>WhatsApp) по</w:t>
+        <w:t>7.2. Стороны безоговорочно соглашаются с тем, что вся переписка, извещения и уведомления, полученные на адреса электронной почты, а также мессенджеры (</w:t>
+      </w:r>
+      <w:r>
+        <w:rPr>
+          <w:color w:val="auto"/>
+          <w:sz w:val="20"/>
+        </w:rPr>
+        <w:t>Viber</w:t>
+      </w:r>
+      <w:r>
+        <w:rPr>
+          <w:color w:val="auto"/>
+          <w:sz w:val="20"/>
+        </w:rPr>
+        <w:t xml:space="preserve">, Telegram, </w:t>
+      </w:r>
+      <w:r>
+        <w:rPr>
+          <w:color w:val="auto"/>
+          <w:sz w:val="20"/>
+        </w:rPr>
+        <w:t>WhatsApp</w:t>
+      </w:r>
+      <w:r>
+        <w:rPr>
+          <w:color w:val="auto"/>
+          <w:sz w:val="20"/>
+        </w:rPr>
+        <w:t>) по</w:t>
       </w:r>
       <w:r>
         <w:rPr>
@@ -1653,7 +1740,13 @@
         <w:rPr>
           <w:sz w:val="20"/>
         </w:rPr>
-        <w:t xml:space="preserve">ontractNumber}} </w:t>
+        <w:t>ontractNumber</w:t>
+      </w:r>
+      <w:r>
+        <w:rPr>
+          <w:sz w:val="20"/>
+        </w:rPr>
+        <w:t xml:space="preserve">}} </w:t>
       </w:r>
       <w:r>
         <w:rPr>
@@ -1693,7 +1786,13 @@
         <w:rPr>
           <w:sz w:val="20"/>
         </w:rPr>
-        <w:t xml:space="preserve">ontractDate}} </w:t>
+        <w:t>ontractDate</w:t>
+      </w:r>
+      <w:r>
+        <w:rPr>
+          <w:sz w:val="20"/>
+        </w:rPr>
+        <w:t xml:space="preserve">}} </w:t>
       </w:r>
       <w:r>
         <w:rPr>
@@ -2134,7 +2233,14 @@
                 <w:rFonts w:ascii="Times New Roman" w:hAnsi="Times New Roman"/>
                 <w:sz w:val="20"/>
               </w:rPr>
-              <w:t>{{seller</w:t>
+              <w:t>{{</w:t>
+            </w:r>
+            <w:r>
+              <w:rPr>
+                <w:rFonts w:ascii="Times New Roman" w:hAnsi="Times New Roman"/>
+                <w:sz w:val="20"/>
+              </w:rPr>
+              <w:t>seller</w:t>
             </w:r>
             <w:r>
               <w:rPr>
@@ -2149,7 +2255,14 @@
                 <w:rFonts w:ascii="Times New Roman" w:hAnsi="Times New Roman"/>
                 <w:sz w:val="20"/>
               </w:rPr>
-              <w:t>ullName}}</w:t>
+              <w:t>ullName</w:t>
+            </w:r>
+            <w:r>
+              <w:rPr>
+                <w:rFonts w:ascii="Times New Roman" w:hAnsi="Times New Roman"/>
+                <w:sz w:val="20"/>
+              </w:rPr>
+              <w:t>}}</w:t>
             </w:r>
           </w:p>
         </w:tc>
@@ -2224,7 +2337,25 @@
                 <w:sz w:val="20"/>
                 <w:lang w:val="ru-RU" w:eastAsia="en-US"/>
               </w:rPr>
-              <w:t>231300 г. Лида, б-р князя Гедимина, д.12 пом.9</w:t>
+              <w:t xml:space="preserve">231300 г. Лида, б-р князя </w:t>
+            </w:r>
+            <w:r>
+              <w:rPr>
+                <w:rFonts w:ascii="Times New Roman" w:eastAsia="Calibri" w:hAnsi="Times New Roman"/>
+                <w:color w:val="auto"/>
+                <w:sz w:val="20"/>
+                <w:lang w:val="ru-RU" w:eastAsia="en-US"/>
+              </w:rPr>
+              <w:t>Гедимина</w:t>
+            </w:r>
+            <w:r>
+              <w:rPr>
+                <w:rFonts w:ascii="Times New Roman" w:eastAsia="Calibri" w:hAnsi="Times New Roman"/>
+                <w:color w:val="auto"/>
+                <w:sz w:val="20"/>
+                <w:lang w:val="ru-RU" w:eastAsia="en-US"/>
+              </w:rPr>
+              <w:t>, д.12 пом.9</w:t>
             </w:r>
           </w:p>
         </w:tc>
@@ -2387,7 +2518,15 @@
                 <w:sz w:val="20"/>
                 <w:lang w:val="en-US" w:eastAsia="en-US"/>
               </w:rPr>
-              <w:t xml:space="preserve">:ALFABY2X   </w:t>
+              <w:t>:ALFABY</w:t>
+            </w:r>
+            <w:r>
+              <w:rPr>
+                <w:rFonts w:ascii="Times New Roman" w:hAnsi="Times New Roman"/>
+                <w:sz w:val="20"/>
+                <w:lang w:val="en-US" w:eastAsia="en-US"/>
+              </w:rPr>
+              <w:t xml:space="preserve">2X   </w:t>
             </w:r>
           </w:p>
         </w:tc>
@@ -2437,7 +2576,14 @@
                 <w:rFonts w:ascii="Times New Roman" w:hAnsi="Times New Roman"/>
                 <w:sz w:val="20"/>
               </w:rPr>
-              <w:t>{{seller</w:t>
+              <w:t>{{</w:t>
+            </w:r>
+            <w:r>
+              <w:rPr>
+                <w:rFonts w:ascii="Times New Roman" w:hAnsi="Times New Roman"/>
+                <w:sz w:val="20"/>
+              </w:rPr>
+              <w:t>seller</w:t>
             </w:r>
             <w:r>
               <w:rPr>
@@ -2452,7 +2598,14 @@
                 <w:rFonts w:ascii="Times New Roman" w:hAnsi="Times New Roman"/>
                 <w:sz w:val="20"/>
               </w:rPr>
-              <w:t>assport}}</w:t>
+              <w:t>assport</w:t>
+            </w:r>
+            <w:r>
+              <w:rPr>
+                <w:rFonts w:ascii="Times New Roman" w:hAnsi="Times New Roman"/>
+                <w:sz w:val="20"/>
+              </w:rPr>
+              <w:t>}}</w:t>
             </w:r>
           </w:p>
         </w:tc>
@@ -2531,7 +2684,14 @@
                 <w:rFonts w:ascii="Times New Roman" w:hAnsi="Times New Roman"/>
                 <w:sz w:val="20"/>
               </w:rPr>
-              <w:t>{{seller</w:t>
+              <w:t>{{</w:t>
+            </w:r>
+            <w:r>
+              <w:rPr>
+                <w:rFonts w:ascii="Times New Roman" w:hAnsi="Times New Roman"/>
+                <w:sz w:val="20"/>
+              </w:rPr>
+              <w:t>seller</w:t>
             </w:r>
             <w:r>
               <w:rPr>
@@ -2561,7 +2721,14 @@
                 <w:rFonts w:ascii="Times New Roman" w:hAnsi="Times New Roman"/>
                 <w:sz w:val="20"/>
               </w:rPr>
-              <w:t xml:space="preserve"> {{seller.</w:t>
+              <w:t xml:space="preserve"> {{</w:t>
+            </w:r>
+            <w:r>
+              <w:rPr>
+                <w:rFonts w:ascii="Times New Roman" w:hAnsi="Times New Roman"/>
+                <w:sz w:val="20"/>
+              </w:rPr>
+              <w:t>seller.</w:t>
             </w:r>
             <w:r>
               <w:rPr>
@@ -2604,7 +2771,25 @@
                 <w:sz w:val="20"/>
                 <w:lang w:val="ru-RU" w:eastAsia="en-US"/>
               </w:rPr>
-              <w:t>220007, г.Минск, ул.Сурганова,43-47</w:t>
+              <w:t xml:space="preserve">220007, </w:t>
+            </w:r>
+            <w:r>
+              <w:rPr>
+                <w:rFonts w:ascii="Times New Roman" w:eastAsia="Calibri" w:hAnsi="Times New Roman"/>
+                <w:color w:val="auto"/>
+                <w:sz w:val="20"/>
+                <w:lang w:val="ru-RU" w:eastAsia="en-US"/>
+              </w:rPr>
+              <w:t>г.Минск</w:t>
+            </w:r>
+            <w:r>
+              <w:rPr>
+                <w:rFonts w:ascii="Times New Roman" w:eastAsia="Calibri" w:hAnsi="Times New Roman"/>
+                <w:color w:val="auto"/>
+                <w:sz w:val="20"/>
+                <w:lang w:val="ru-RU" w:eastAsia="en-US"/>
+              </w:rPr>
+              <w:t>, ул.Сурганова,43-47</w:t>
             </w:r>
           </w:p>
         </w:tc>
@@ -2654,7 +2839,14 @@
                 <w:rFonts w:ascii="Times New Roman" w:hAnsi="Times New Roman"/>
                 <w:sz w:val="20"/>
               </w:rPr>
-              <w:t>{{seller</w:t>
+              <w:t>{{</w:t>
+            </w:r>
+            <w:r>
+              <w:rPr>
+                <w:rFonts w:ascii="Times New Roman" w:hAnsi="Times New Roman"/>
+                <w:sz w:val="20"/>
+              </w:rPr>
+              <w:t>seller</w:t>
             </w:r>
             <w:r>
               <w:rPr>
@@ -2662,7 +2854,15 @@
                 <w:sz w:val="20"/>
                 <w:lang w:val="en-US"/>
               </w:rPr>
-              <w:t>.i</w:t>
+              <w:t>.</w:t>
+            </w:r>
+            <w:r>
+              <w:rPr>
+                <w:rFonts w:ascii="Times New Roman" w:hAnsi="Times New Roman"/>
+                <w:sz w:val="20"/>
+                <w:lang w:val="en-US"/>
+              </w:rPr>
+              <w:t>i</w:t>
             </w:r>
             <w:r>
               <w:rPr>
@@ -2748,7 +2948,14 @@
                 <w:rFonts w:ascii="Times New Roman" w:hAnsi="Times New Roman"/>
                 <w:sz w:val="20"/>
               </w:rPr>
-              <w:t>{{seller</w:t>
+              <w:t>{{</w:t>
+            </w:r>
+            <w:r>
+              <w:rPr>
+                <w:rFonts w:ascii="Times New Roman" w:hAnsi="Times New Roman"/>
+                <w:sz w:val="20"/>
+              </w:rPr>
+              <w:t>seller</w:t>
             </w:r>
             <w:r>
               <w:rPr>
@@ -2763,7 +2970,14 @@
                 <w:rFonts w:ascii="Times New Roman" w:hAnsi="Times New Roman"/>
                 <w:sz w:val="20"/>
               </w:rPr>
-              <w:t>hone}}</w:t>
+              <w:t>hone</w:t>
+            </w:r>
+            <w:r>
+              <w:rPr>
+                <w:rFonts w:ascii="Times New Roman" w:hAnsi="Times New Roman"/>
+                <w:sz w:val="20"/>
+              </w:rPr>
+              <w:t>}}</w:t>
             </w:r>
           </w:p>
         </w:tc>
@@ -2849,7 +3063,16 @@
                 <w:sz w:val="20"/>
                 <w:lang w:val="en-US" w:eastAsia="ru-RU"/>
               </w:rPr>
-              <w:t xml:space="preserve"> {{seller.</w:t>
+              <w:t xml:space="preserve"> {{</w:t>
+            </w:r>
+            <w:r>
+              <w:rPr>
+                <w:rFonts w:ascii="Times New Roman" w:hAnsi="Times New Roman"/>
+                <w:color w:val="auto"/>
+                <w:sz w:val="20"/>
+                <w:lang w:val="en-US" w:eastAsia="ru-RU"/>
+              </w:rPr>
+              <w:t>seller.</w:t>
             </w:r>
             <w:r>
               <w:rPr>
@@ -3019,7 +3242,15 @@
           <w:color w:val="auto"/>
           <w:sz w:val="20"/>
         </w:rPr>
-        <w:t>№ {{deal</w:t>
+        <w:t>№ {{</w:t>
+      </w:r>
+      <w:r>
+        <w:rPr>
+          <w:rFonts w:ascii="Times New Roman" w:hAnsi="Times New Roman"/>
+          <w:color w:val="auto"/>
+          <w:sz w:val="20"/>
+        </w:rPr>
+        <w:t>deal</w:t>
       </w:r>
       <w:r>
         <w:rPr>
@@ -3035,7 +3266,15 @@
           <w:color w:val="auto"/>
           <w:sz w:val="20"/>
         </w:rPr>
-        <w:t>umber}} от {{</w:t>
+        <w:t>umber</w:t>
+      </w:r>
+      <w:r>
+        <w:rPr>
+          <w:rFonts w:ascii="Times New Roman" w:hAnsi="Times New Roman"/>
+          <w:color w:val="auto"/>
+          <w:sz w:val="20"/>
+        </w:rPr>
+        <w:t>}} от {{</w:t>
       </w:r>
       <w:r>
         <w:rPr>
@@ -3260,6 +3499,7 @@
         <w:tc>
           <w:tcPr>
             <w:tcW w:w="562" w:type="dxa"/>
+            <w:vAlign w:val="center"/>
           </w:tcPr>
           <w:p>
             <w:pPr>
@@ -3274,31 +3514,14 @@
                 <w:sz w:val="20"/>
               </w:rPr>
             </w:pPr>
-            <w:sdt>
-              <w:sdtPr>
-                <w:rPr>
-                  <w:rFonts w:ascii="Times New Roman" w:hAnsi="Times New Roman"/>
-                  <w:color w:val="auto"/>
-                  <w:sz w:val="20"/>
-                </w:rPr>
-                <w:id w:val="1727797618"/>
-                <w14:checkbox>
-                  <w14:checked w14:val="0"/>
-                  <w14:checkedState w14:val="2612" w14:font="MS Gothic"/>
-                  <w14:uncheckedState w14:val="2610" w14:font="MS Gothic"/>
-                </w14:checkbox>
-              </w:sdtPr>
-              <w:sdtContent>
-                <w:r>
-                  <w:rPr>
-                    <w:rFonts w:ascii="Segoe UI Symbol" w:hAnsi="Segoe UI Symbol" w:cs="Segoe UI Symbol"/>
-                    <w:color w:val="auto"/>
-                    <w:sz w:val="20"/>
-                  </w:rPr>
-                  <w:t>☐</w:t>
-                </w:r>
-              </w:sdtContent>
-            </w:sdt>
+            <w:r>
+              <w:rPr>
+                <w:rFonts w:ascii="Times New Roman" w:hAnsi="Times New Roman"/>
+                <w:color w:val="auto"/>
+                <w:sz w:val="20"/>
+              </w:rPr>
+              <w:t>{{cb_1}}</w:t>
+            </w:r>
           </w:p>
         </w:tc>
         <w:tc>
@@ -3443,7 +3666,15 @@
                 <w:color w:val="auto"/>
                 <w:sz w:val="20"/>
               </w:rPr>
-              <w:t>на ведущих интернет-платформах: Realt.by, Kufar.by</w:t>
+              <w:t xml:space="preserve">на ведущих интернет-платформах: Realt.by, </w:t>
+            </w:r>
+            <w:r>
+              <w:rPr>
+                <w:rFonts w:ascii="Times New Roman" w:hAnsi="Times New Roman"/>
+                <w:color w:val="auto"/>
+                <w:sz w:val="20"/>
+              </w:rPr>
+              <w:t>Kufar.by</w:t>
             </w:r>
             <w:r>
               <w:rPr>
@@ -3561,6 +3792,7 @@
         <w:tc>
           <w:tcPr>
             <w:tcW w:w="562" w:type="dxa"/>
+            <w:vAlign w:val="center"/>
           </w:tcPr>
           <w:p>
             <w:pPr>
@@ -3574,31 +3806,14 @@
                 <w:sz w:val="20"/>
               </w:rPr>
             </w:pPr>
-            <w:sdt>
-              <w:sdtPr>
-                <w:rPr>
-                  <w:rFonts w:ascii="Times New Roman" w:hAnsi="Times New Roman"/>
-                  <w:color w:val="auto"/>
-                  <w:sz w:val="20"/>
-                </w:rPr>
-                <w:id w:val="-2078192741"/>
-                <w14:checkbox>
-                  <w14:checked w14:val="0"/>
-                  <w14:checkedState w14:val="2612" w14:font="MS Gothic"/>
-                  <w14:uncheckedState w14:val="2610" w14:font="MS Gothic"/>
-                </w14:checkbox>
-              </w:sdtPr>
-              <w:sdtContent>
-                <w:r>
-                  <w:rPr>
-                    <w:rFonts w:ascii="Segoe UI Symbol" w:hAnsi="Segoe UI Symbol" w:cs="Segoe UI Symbol"/>
-                    <w:color w:val="auto"/>
-                    <w:sz w:val="20"/>
-                  </w:rPr>
-                  <w:t>☐</w:t>
-                </w:r>
-              </w:sdtContent>
-            </w:sdt>
+            <w:r>
+              <w:rPr>
+                <w:rFonts w:ascii="Times New Roman" w:hAnsi="Times New Roman"/>
+                <w:color w:val="auto"/>
+                <w:sz w:val="20"/>
+              </w:rPr>
+              <w:t>{{cb_2}}</w:t>
+            </w:r>
           </w:p>
         </w:tc>
         <w:tc>
@@ -3657,7 +3872,15 @@
                 <w:color w:val="auto"/>
                 <w:sz w:val="20"/>
               </w:rPr>
-              <w:t>идео-обзор</w:t>
+              <w:t>идео</w:t>
+            </w:r>
+            <w:r>
+              <w:rPr>
+                <w:rStyle w:val="a5"/>
+                <w:color w:val="auto"/>
+                <w:sz w:val="20"/>
+              </w:rPr>
+              <w:t>-обзор</w:t>
             </w:r>
             <w:r>
               <w:rPr>
@@ -3900,6 +4123,7 @@
         <w:tc>
           <w:tcPr>
             <w:tcW w:w="562" w:type="dxa"/>
+            <w:vAlign w:val="center"/>
           </w:tcPr>
           <w:p>
             <w:pPr>
@@ -3913,31 +4137,14 @@
                 <w:sz w:val="20"/>
               </w:rPr>
             </w:pPr>
-            <w:sdt>
-              <w:sdtPr>
-                <w:rPr>
-                  <w:rFonts w:ascii="Times New Roman" w:hAnsi="Times New Roman"/>
-                  <w:color w:val="auto"/>
-                  <w:sz w:val="20"/>
-                </w:rPr>
-                <w:id w:val="-908920914"/>
-                <w14:checkbox>
-                  <w14:checked w14:val="0"/>
-                  <w14:checkedState w14:val="2612" w14:font="MS Gothic"/>
-                  <w14:uncheckedState w14:val="2610" w14:font="MS Gothic"/>
-                </w14:checkbox>
-              </w:sdtPr>
-              <w:sdtContent>
-                <w:r>
-                  <w:rPr>
-                    <w:rFonts w:ascii="MS Gothic" w:eastAsia="MS Gothic" w:hAnsi="MS Gothic" w:hint="eastAsia"/>
-                    <w:color w:val="auto"/>
-                    <w:sz w:val="20"/>
-                  </w:rPr>
-                  <w:t>☐</w:t>
-                </w:r>
-              </w:sdtContent>
-            </w:sdt>
+            <w:r>
+              <w:rPr>
+                <w:rFonts w:ascii="Times New Roman" w:hAnsi="Times New Roman"/>
+                <w:color w:val="auto"/>
+                <w:sz w:val="20"/>
+              </w:rPr>
+              <w:t>{{cb_3}}</w:t>
+            </w:r>
           </w:p>
         </w:tc>
         <w:tc>
@@ -3996,7 +4203,15 @@
                 <w:color w:val="auto"/>
                 <w:sz w:val="20"/>
               </w:rPr>
-              <w:t>идео-обзор</w:t>
+              <w:t>идео</w:t>
+            </w:r>
+            <w:r>
+              <w:rPr>
+                <w:rStyle w:val="a5"/>
+                <w:color w:val="auto"/>
+                <w:sz w:val="20"/>
+              </w:rPr>
+              <w:t>-обзор</w:t>
             </w:r>
             <w:r>
               <w:rPr>
@@ -4352,6 +4567,7 @@
         <w:tc>
           <w:tcPr>
             <w:tcW w:w="562" w:type="dxa"/>
+            <w:vAlign w:val="center"/>
           </w:tcPr>
           <w:p>
             <w:pPr>
@@ -4365,31 +4581,14 @@
                 <w:sz w:val="20"/>
               </w:rPr>
             </w:pPr>
-            <w:sdt>
-              <w:sdtPr>
-                <w:rPr>
-                  <w:rFonts w:ascii="Times New Roman" w:hAnsi="Times New Roman"/>
-                  <w:color w:val="auto"/>
-                  <w:sz w:val="20"/>
-                </w:rPr>
-                <w:id w:val="-969897707"/>
-                <w14:checkbox>
-                  <w14:checked w14:val="0"/>
-                  <w14:checkedState w14:val="2612" w14:font="MS Gothic"/>
-                  <w14:uncheckedState w14:val="2610" w14:font="MS Gothic"/>
-                </w14:checkbox>
-              </w:sdtPr>
-              <w:sdtContent>
-                <w:r>
-                  <w:rPr>
-                    <w:rFonts w:ascii="MS Gothic" w:eastAsia="MS Gothic" w:hAnsi="MS Gothic" w:hint="eastAsia"/>
-                    <w:color w:val="auto"/>
-                    <w:sz w:val="20"/>
-                  </w:rPr>
-                  <w:t>☐</w:t>
-                </w:r>
-              </w:sdtContent>
-            </w:sdt>
+            <w:r>
+              <w:rPr>
+                <w:rFonts w:ascii="Times New Roman" w:hAnsi="Times New Roman"/>
+                <w:color w:val="auto"/>
+                <w:sz w:val="20"/>
+              </w:rPr>
+              <w:t>{{cb_4}}</w:t>
+            </w:r>
           </w:p>
         </w:tc>
         <w:tc>
@@ -4448,7 +4647,15 @@
                 <w:color w:val="auto"/>
                 <w:sz w:val="20"/>
               </w:rPr>
-              <w:t>идео-обзор</w:t>
+              <w:t>идео</w:t>
+            </w:r>
+            <w:r>
+              <w:rPr>
+                <w:rStyle w:val="a5"/>
+                <w:color w:val="auto"/>
+                <w:sz w:val="20"/>
+              </w:rPr>
+              <w:t>-обзор</w:t>
             </w:r>
             <w:r>
               <w:rPr>
@@ -4716,7 +4923,31 @@
                 <w:color w:val="auto"/>
                 <w:sz w:val="20"/>
               </w:rPr>
-              <w:t xml:space="preserve">Instagram, TikTok </w:t>
+              <w:t>Instagram</w:t>
+            </w:r>
+            <w:r>
+              <w:rPr>
+                <w:b/>
+                <w:color w:val="auto"/>
+                <w:sz w:val="20"/>
+              </w:rPr>
+              <w:t xml:space="preserve">, </w:t>
+            </w:r>
+            <w:r>
+              <w:rPr>
+                <w:b/>
+                <w:color w:val="auto"/>
+                <w:sz w:val="20"/>
+              </w:rPr>
+              <w:t>TikTok</w:t>
+            </w:r>
+            <w:r>
+              <w:rPr>
+                <w:b/>
+                <w:color w:val="auto"/>
+                <w:sz w:val="20"/>
+              </w:rPr>
+              <w:t xml:space="preserve"> </w:t>
             </w:r>
             <w:r>
               <w:rPr>
@@ -5065,7 +5296,16 @@
                 <w:sz w:val="20"/>
                 <w:lang w:val="en-US" w:eastAsia="ru-RU"/>
               </w:rPr>
-              <w:t>{{seller.</w:t>
+              <w:t>{{</w:t>
+            </w:r>
+            <w:r>
+              <w:rPr>
+                <w:rFonts w:ascii="Times New Roman" w:hAnsi="Times New Roman"/>
+                <w:color w:val="auto"/>
+                <w:sz w:val="20"/>
+                <w:lang w:val="en-US" w:eastAsia="ru-RU"/>
+              </w:rPr>
+              <w:t>seller.</w:t>
             </w:r>
             <w:r>
               <w:rPr>
@@ -5202,7 +5442,7 @@
 </file>
 
 <file path=word/numbering.xml><?xml version="1.0" encoding="utf-8"?>
-<w:numbering xmlns:wpc="http://schemas.microsoft.com/office/word/2010/wordprocessingCanvas" xmlns:cx="http://schemas.microsoft.com/office/drawing/2014/chartex" xmlns:cx1="http://schemas.microsoft.com/office/drawing/2015/9/8/chartex" xmlns:cx2="http://schemas.microsoft.com/office/drawing/2015/10/21/chartex" xmlns:cx3="http://schemas.microsoft.com/office/drawing/2016/5/9/chartex" xmlns:cx4="http://schemas.microsoft.com/office/drawing/2016/5/10/chartex" xmlns:cx5="http://schemas.microsoft.com/office/drawing/2016/5/11/chartex" xmlns:cx6="http://schemas.microsoft.com/office/drawing/2016/5/12/chartex" xmlns:cx7="http://schemas.microsoft.com/office/drawing/2016/5/13/chartex" xmlns:cx8="http://schemas.microsoft.com/office/drawing/2016/5/14/chartex" xmlns:mc="http://schemas.openxmlformats.org/markup-compatibility/2006" xmlns:aink="http://schemas.microsoft.com/office/drawing/2016/ink" xmlns:am3d="http://schemas.microsoft.com/office/drawing/2017/model3d" xmlns:o="urn:schemas-microsoft-com:office:office" xmlns:oel="http://schemas.microsoft.com/office/2019/extlst" xmlns:r="http://schemas.openxmlformats.org/officeDocument/2006/relationships" xmlns:m="http://schemas.openxmlformats.org/officeDocument/2006/math" xmlns:v="urn:schemas-microsoft-com:vml" xmlns:wp14="http://schemas.microsoft.com/office/word/2010/wordprocessingDrawing" xmlns:wp="http://schemas.openxmlformats.org/drawingml/2006/wordprocessingDrawing" xmlns:w10="urn:schemas-microsoft-com:office:word" xmlns:w="http://schemas.openxmlformats.org/wordprocessingml/2006/main" xmlns:w14="http://schemas.microsoft.com/office/word/2010/wordml" xmlns:w15="http://schemas.microsoft.com/office/word/2012/wordml" xmlns:w16cex="http://schemas.microsoft.com/office/word/2018/wordml/cex" xmlns:w16cid="http://schemas.microsoft.com/office/word/2016/wordml/cid" xmlns:w16="http://schemas.microsoft.com/office/word/2018/wordml" xmlns:w16du="http://schemas.microsoft.com/office/word/2023/wordml/word16du" xmlns:w16sdtdh="http://schemas.microsoft.com/office/word/2020/wordml/sdtdatahash" xmlns:w16sdtfl="http://schemas.microsoft.com/office/word/2024/wordml/sdtformatlock" xmlns:w16se="http://schemas.microsoft.com/office/word/2015/wordml/symex" xmlns:wpg="http://schemas.microsoft.com/office/word/2010/wordprocessingGroup" xmlns:wpi="http://schemas.microsoft.com/office/word/2010/wordprocessingInk" xmlns:wne="http://schemas.microsoft.com/office/word/2006/wordml" xmlns:wps="http://schemas.microsoft.com/office/word/2010/wordprocessingShape" mc:Ignorable="w14 w15 w16se w16cid w16 w16cex w16sdtdh w16sdtfl w16du wp14">
+<w:numbering xmlns:wpc="http://schemas.microsoft.com/office/word/2010/wordprocessingCanvas" xmlns:cx="http://schemas.microsoft.com/office/drawing/2014/chartex" xmlns:cx1="http://schemas.microsoft.com/office/drawing/2015/9/8/chartex" xmlns:cx2="http://schemas.microsoft.com/office/drawing/2015/10/21/chartex" xmlns:cx3="http://schemas.microsoft.com/office/drawing/2016/5/9/chartex" xmlns:cx4="http://schemas.microsoft.com/office/drawing/2016/5/10/chartex" xmlns:cx5="http://schemas.microsoft.com/office/drawing/2016/5/11/chartex" xmlns:cx6="http://schemas.microsoft.com/office/drawing/2016/5/12/chartex" xmlns:cx7="http://schemas.microsoft.com/office/drawing/2016/5/13/chartex" xmlns:cx8="http://schemas.microsoft.com/office/drawing/2016/5/14/chartex" xmlns:mc="http://schemas.openxmlformats.org/markup-compatibility/2006" xmlns:aink="http://schemas.microsoft.com/office/drawing/2016/ink" xmlns:am3d="http://schemas.microsoft.com/office/drawing/2017/model3d" xmlns:o="urn:schemas-microsoft-com:office:office" xmlns:r="http://schemas.openxmlformats.org/officeDocument/2006/relationships" xmlns:m="http://schemas.openxmlformats.org/officeDocument/2006/math" xmlns:v="urn:schemas-microsoft-com:vml" xmlns:wp14="http://schemas.microsoft.com/office/word/2010/wordprocessingDrawing" xmlns:wp="http://schemas.openxmlformats.org/drawingml/2006/wordprocessingDrawing" xmlns:w10="urn:schemas-microsoft-com:office:word" xmlns:w="http://schemas.openxmlformats.org/wordprocessingml/2006/main" xmlns:w14="http://schemas.microsoft.com/office/word/2010/wordml" xmlns:w15="http://schemas.microsoft.com/office/word/2012/wordml" xmlns:w16cex="http://schemas.microsoft.com/office/word/2018/wordml/cex" xmlns:w16cid="http://schemas.microsoft.com/office/word/2016/wordml/cid" xmlns:w16="http://schemas.microsoft.com/office/word/2018/wordml" xmlns:w16sdtdh="http://schemas.microsoft.com/office/word/2020/wordml/sdtdatahash" xmlns:w16se="http://schemas.microsoft.com/office/word/2015/wordml/symex" xmlns:wpg="http://schemas.microsoft.com/office/word/2010/wordprocessingGroup" xmlns:wpi="http://schemas.microsoft.com/office/word/2010/wordprocessingInk" xmlns:wne="http://schemas.microsoft.com/office/word/2006/wordml" xmlns:wps="http://schemas.microsoft.com/office/word/2010/wordprocessingShape" mc:Ignorable="w14 w15 w16se w16cid w16 w16cex w16sdtdh wp14">
   <w:abstractNum w:abstractNumId="0" w15:restartNumberingAfterBreak="0">
     <w:nsid w:val="0AB750E5"/>
     <w:multiLevelType w:val="multilevel"/>
@@ -6571,41 +6811,41 @@
       </w:rPr>
     </w:lvl>
   </w:abstractNum>
-  <w:num w:numId="1" w16cid:durableId="770319687">
+  <w:num w:numId="1">
     <w:abstractNumId w:val="3"/>
   </w:num>
-  <w:num w:numId="2" w16cid:durableId="1687517465">
+  <w:num w:numId="2">
     <w:abstractNumId w:val="1"/>
   </w:num>
-  <w:num w:numId="3" w16cid:durableId="502210389">
+  <w:num w:numId="3">
     <w:abstractNumId w:val="4"/>
   </w:num>
-  <w:num w:numId="4" w16cid:durableId="1330526945">
+  <w:num w:numId="4">
     <w:abstractNumId w:val="0"/>
   </w:num>
-  <w:num w:numId="5" w16cid:durableId="1397699641">
+  <w:num w:numId="5">
     <w:abstractNumId w:val="9"/>
   </w:num>
-  <w:num w:numId="6" w16cid:durableId="1160275046">
+  <w:num w:numId="6">
     <w:abstractNumId w:val="8"/>
   </w:num>
-  <w:num w:numId="7" w16cid:durableId="920217381">
+  <w:num w:numId="7">
     <w:abstractNumId w:val="2"/>
   </w:num>
-  <w:num w:numId="8" w16cid:durableId="2134596462">
+  <w:num w:numId="8">
     <w:abstractNumId w:val="5"/>
   </w:num>
-  <w:num w:numId="9" w16cid:durableId="794100202">
+  <w:num w:numId="9">
     <w:abstractNumId w:val="6"/>
   </w:num>
-  <w:num w:numId="10" w16cid:durableId="1663309800">
+  <w:num w:numId="10">
     <w:abstractNumId w:val="7"/>
   </w:num>
 </w:numbering>
 </file>
 
 <file path=word/styles.xml><?xml version="1.0" encoding="utf-8"?>
-<w:styles xmlns:mc="http://schemas.openxmlformats.org/markup-compatibility/2006" xmlns:r="http://schemas.openxmlformats.org/officeDocument/2006/relationships" xmlns:w="http://schemas.openxmlformats.org/wordprocessingml/2006/main" xmlns:w14="http://schemas.microsoft.com/office/word/2010/wordml" xmlns:w15="http://schemas.microsoft.com/office/word/2012/wordml" xmlns:w16cex="http://schemas.microsoft.com/office/word/2018/wordml/cex" xmlns:w16cid="http://schemas.microsoft.com/office/word/2016/wordml/cid" xmlns:w16="http://schemas.microsoft.com/office/word/2018/wordml" xmlns:w16du="http://schemas.microsoft.com/office/word/2023/wordml/word16du" xmlns:w16sdtdh="http://schemas.microsoft.com/office/word/2020/wordml/sdtdatahash" xmlns:w16sdtfl="http://schemas.microsoft.com/office/word/2024/wordml/sdtformatlock" xmlns:w16se="http://schemas.microsoft.com/office/word/2015/wordml/symex" mc:Ignorable="w14 w15 w16se w16cid w16 w16cex w16sdtdh w16sdtfl w16du">
+<w:styles xmlns:mc="http://schemas.openxmlformats.org/markup-compatibility/2006" xmlns:r="http://schemas.openxmlformats.org/officeDocument/2006/relationships" xmlns:w="http://schemas.openxmlformats.org/wordprocessingml/2006/main" xmlns:w14="http://schemas.microsoft.com/office/word/2010/wordml" xmlns:w15="http://schemas.microsoft.com/office/word/2012/wordml" xmlns:w16cex="http://schemas.microsoft.com/office/word/2018/wordml/cex" xmlns:w16cid="http://schemas.microsoft.com/office/word/2016/wordml/cid" xmlns:w16="http://schemas.microsoft.com/office/word/2018/wordml" xmlns:w16sdtdh="http://schemas.microsoft.com/office/word/2020/wordml/sdtdatahash" xmlns:w16se="http://schemas.microsoft.com/office/word/2015/wordml/symex" mc:Ignorable="w14 w15 w16se w16cid w16 w16cex w16sdtdh">
   <w:docDefaults>
     <w:rPrDefault>
       <w:rPr>

</xml_diff>

<commit_message>
Update application logic and advertising contract template
Replit-Commit-Author: Agent
</commit_message>
<xml_diff>
--- a/templates/working/Договор_реклама.docx
+++ b/templates/working/Договор_реклама.docx
@@ -2078,6 +2078,11 @@
           <w:sz w:val="20"/>
         </w:rPr>
         <w:t>11. РЕКВИЗИТЫ СТОРОН:</w:t>
+      </w:r>
+    </w:p>
+    <w:p>
+      <w:r>
+        <w:t xml:space="preserve">{#signatories}</w:t>
       </w:r>
     </w:p>
     <w:tbl>
@@ -2996,6 +3001,11 @@
       </w:tr>
     </w:tbl>
     <w:p>
+      <w:r>
+        <w:t xml:space="preserve">{/signatories}</w:t>
+      </w:r>
+    </w:p>
+    <w:p>
       <w:pPr>
         <w:spacing w:line="240" w:lineRule="auto"/>
         <w:rPr>
@@ -4981,6 +4991,11 @@
         <w:t>.</w:t>
       </w:r>
     </w:p>
+    <w:p>
+      <w:r>
+        <w:t xml:space="preserve">{#signatories}</w:t>
+      </w:r>
+    </w:p>
     <w:tbl>
       <w:tblPr>
         <w:tblStyle w:val="aa"/>
@@ -5192,6 +5207,11 @@
         </w:tc>
       </w:tr>
     </w:tbl>
+    <w:p>
+      <w:r>
+        <w:t xml:space="preserve">{/signatories}</w:t>
+      </w:r>
+    </w:p>
     <w:p>
       <w:pPr>
         <w:jc w:val="both"/>

</xml_diff>

<commit_message>
Update advertising contract template
Replit-Commit-Author: Agent
</commit_message>
<xml_diff>
--- a/templates/working/Договор_реклама.docx
+++ b/templates/working/Договор_реклама.docx
@@ -184,108 +184,7 @@
           <w:rFonts w:ascii="Times New Roman" w:hAnsi="Times New Roman"/>
           <w:sz w:val="20"/>
         </w:rPr>
-        <w:t>{{</w:t>
-      </w:r>
-      <w:proofErr w:type="spellStart"/>
-      <w:r>
-        <w:rPr>
-          <w:rFonts w:ascii="Times New Roman" w:hAnsi="Times New Roman"/>
-          <w:sz w:val="20"/>
-        </w:rPr>
-        <w:t>seller</w:t>
-      </w:r>
-      <w:r>
-        <w:rPr>
-          <w:rFonts w:ascii="Times New Roman" w:hAnsi="Times New Roman"/>
-          <w:sz w:val="20"/>
-        </w:rPr>
-        <w:t>.f</w:t>
-      </w:r>
-      <w:r>
-        <w:rPr>
-          <w:rFonts w:ascii="Times New Roman" w:hAnsi="Times New Roman"/>
-          <w:sz w:val="20"/>
-        </w:rPr>
-        <w:t>ullName</w:t>
-      </w:r>
-      <w:proofErr w:type="spellEnd"/>
-      <w:r>
-        <w:rPr>
-          <w:rFonts w:ascii="Times New Roman" w:hAnsi="Times New Roman"/>
-          <w:sz w:val="20"/>
-        </w:rPr>
-        <w:t>}}</w:t>
-      </w:r>
-      <w:r>
-        <w:rPr>
-          <w:rFonts w:ascii="Times New Roman" w:hAnsi="Times New Roman"/>
-          <w:sz w:val="20"/>
-        </w:rPr>
-        <w:t>{{#seller.poaNumber}}, действующий(</w:t>
-      </w:r>
-      <w:proofErr w:type="spellStart"/>
-      <w:r>
-        <w:rPr>
-          <w:rFonts w:ascii="Times New Roman" w:hAnsi="Times New Roman"/>
-          <w:sz w:val="20"/>
-        </w:rPr>
-        <w:t>ая</w:t>
-      </w:r>
-      <w:proofErr w:type="spellEnd"/>
-      <w:r>
-        <w:rPr>
-          <w:rFonts w:ascii="Times New Roman" w:hAnsi="Times New Roman"/>
-          <w:sz w:val="20"/>
-        </w:rPr>
-        <w:t>) на основании доверенности №{{</w:t>
-      </w:r>
-      <w:proofErr w:type="spellStart"/>
-      <w:r>
-        <w:rPr>
-          <w:rFonts w:ascii="Times New Roman" w:hAnsi="Times New Roman"/>
-          <w:sz w:val="20"/>
-        </w:rPr>
-        <w:t>seller.poaNumber</w:t>
-      </w:r>
-      <w:proofErr w:type="spellEnd"/>
-      <w:r>
-        <w:rPr>
-          <w:rFonts w:ascii="Times New Roman" w:hAnsi="Times New Roman"/>
-          <w:sz w:val="20"/>
-        </w:rPr>
-        <w:t>}} от {{</w:t>
-      </w:r>
-      <w:proofErr w:type="spellStart"/>
-      <w:r>
-        <w:rPr>
-          <w:rFonts w:ascii="Times New Roman" w:hAnsi="Times New Roman"/>
-          <w:sz w:val="20"/>
-        </w:rPr>
-        <w:t>seller.poaDate</w:t>
-      </w:r>
-      <w:proofErr w:type="spellEnd"/>
-      <w:r>
-        <w:rPr>
-          <w:rFonts w:ascii="Times New Roman" w:hAnsi="Times New Roman"/>
-          <w:sz w:val="20"/>
-        </w:rPr>
-        <w:t>}}{{/</w:t>
-      </w:r>
-      <w:proofErr w:type="spellStart"/>
-      <w:r>
-        <w:rPr>
-          <w:rFonts w:ascii="Times New Roman" w:hAnsi="Times New Roman"/>
-          <w:sz w:val="20"/>
-        </w:rPr>
-        <w:t>seller.poaNumber</w:t>
-      </w:r>
-      <w:proofErr w:type="spellEnd"/>
-      <w:r>
-        <w:rPr>
-          <w:rFonts w:ascii="Times New Roman" w:hAnsi="Times New Roman"/>
-          <w:sz w:val="20"/>
-        </w:rPr>
-        <w:t>}}</w:t>
+        <w:t xml:space="preserve">{{owner1.fullName}}{{owner1.poaSuffix}}{{#owner2.fullName}}, {{owner2.fullName}}{{owner2.poaSuffix}}{{/owner2.fullName}}{{#owner3.fullName}}, {{owner3.fullName}}{{owner3.poaSuffix}}{{/owner3.fullName}}</w:t>
       </w:r>
       <w:r>
         <w:rPr>
@@ -324,7 +223,7 @@
           <w:bCs/>
           <w:sz w:val="20"/>
         </w:rPr>
-        <w:t>Общество с ограниченной ответственностью «ГермесГарант»</w:t>
+        <w:t xml:space="preserve">Общество с ограниченной ответственностью «ГермесГарант»</w:t>
       </w:r>
       <w:r>
         <w:rPr>
@@ -347,7 +246,7 @@
           <w:rFonts w:ascii="Times New Roman" w:hAnsi="Times New Roman"/>
           <w:sz w:val="20"/>
         </w:rPr>
-        <w:t>, совместно именуемые "Стороны", заключили настоящий договор о нижеследующем:</w:t>
+        <w:t xml:space="preserve">, совместно именуемые "Стороны", заключили настоящий договор о нижеследующем:</w:t>
       </w:r>
     </w:p>
     <w:p>
@@ -2215,22 +2114,7 @@
                 <w:rFonts w:ascii="Times New Roman" w:hAnsi="Times New Roman"/>
                 <w:sz w:val="20"/>
               </w:rPr>
-              <w:t>{{seller</w:t>
-            </w:r>
-            <w:r>
-              <w:rPr>
-                <w:rFonts w:ascii="Times New Roman" w:hAnsi="Times New Roman"/>
-                <w:sz w:val="20"/>
-                <w:lang w:val="en-US"/>
-              </w:rPr>
-              <w:t>.f</w:t>
-            </w:r>
-            <w:r>
-              <w:rPr>
-                <w:rFonts w:ascii="Times New Roman" w:hAnsi="Times New Roman"/>
-                <w:sz w:val="20"/>
-              </w:rPr>
-              <w:t>ullName}}</w:t>
+              <w:t>{{owner1.fullName}}</w:t>
             </w:r>
           </w:p>
         </w:tc>
@@ -2339,61 +2223,7 @@
                 <w:sz w:val="20"/>
                 <w:lang w:val="ru-RU" w:eastAsia="ru-RU"/>
               </w:rPr>
-              <w:t>Адрес регистрации</w:t>
-            </w:r>
-            <w:r>
-              <w:rPr>
-                <w:rFonts w:ascii="Times New Roman" w:hAnsi="Times New Roman"/>
-                <w:color w:val="auto"/>
-                <w:sz w:val="20"/>
-                <w:lang w:val="en-US" w:eastAsia="ru-RU"/>
-              </w:rPr>
-              <w:t>:</w:t>
-            </w:r>
-            <w:r>
-              <w:rPr>
-                <w:rFonts w:ascii="Times New Roman" w:hAnsi="Times New Roman"/>
-                <w:color w:val="auto"/>
-                <w:sz w:val="20"/>
-                <w:lang w:val="en-US" w:eastAsia="ru-RU"/>
-              </w:rPr>
-              <w:t xml:space="preserve"> {{</w:t>
-            </w:r>
-            <w:r>
-              <w:rPr>
-                <w:rFonts w:ascii="Times New Roman" w:hAnsi="Times New Roman"/>
-                <w:color w:val="auto"/>
-                <w:sz w:val="20"/>
-                <w:lang w:val="en-US" w:eastAsia="ru-RU"/>
-              </w:rPr>
-              <w:t>seller</w:t>
-            </w:r>
-            <w:r>
-              <w:rPr>
-                <w:rFonts w:ascii="Times New Roman" w:hAnsi="Times New Roman"/>
-                <w:color w:val="auto"/>
-                <w:sz w:val="20"/>
-                <w:lang w:val="en-US" w:eastAsia="ru-RU"/>
-              </w:rPr>
-              <w:t>.a</w:t>
-            </w:r>
-            <w:r>
-              <w:rPr>
-                <w:rFonts w:ascii="Times New Roman" w:hAnsi="Times New Roman"/>
-                <w:color w:val="auto"/>
-                <w:sz w:val="20"/>
-                <w:lang w:val="en-US" w:eastAsia="ru-RU"/>
-              </w:rPr>
-              <w:t>ddress</w:t>
-            </w:r>
-            <w:r>
-              <w:rPr>
-                <w:rFonts w:ascii="Times New Roman" w:hAnsi="Times New Roman"/>
-                <w:color w:val="auto"/>
-                <w:sz w:val="20"/>
-                <w:lang w:val="en-US" w:eastAsia="ru-RU"/>
-              </w:rPr>
-              <w:t>}}</w:t>
+              <w:t xml:space="preserve">Адрес регистрации: {{owner1.address}}</w:t>
             </w:r>
           </w:p>
         </w:tc>
@@ -2502,38 +2332,7 @@
                 <w:sz w:val="20"/>
                 <w:lang w:val="ru-RU" w:eastAsia="ru-RU"/>
               </w:rPr>
-              <w:t>Паспорт</w:t>
-            </w:r>
-            <w:r>
-              <w:rPr>
-                <w:rFonts w:ascii="Times New Roman" w:hAnsi="Times New Roman"/>
-                <w:color w:val="auto"/>
-                <w:sz w:val="20"/>
-                <w:lang w:val="en-US" w:eastAsia="ru-RU"/>
-              </w:rPr>
-              <w:t xml:space="preserve"> </w:t>
-            </w:r>
-            <w:r>
-              <w:rPr>
-                <w:rFonts w:ascii="Times New Roman" w:hAnsi="Times New Roman"/>
-                <w:sz w:val="20"/>
-              </w:rPr>
-              <w:t>{{seller</w:t>
-            </w:r>
-            <w:r>
-              <w:rPr>
-                <w:rFonts w:ascii="Times New Roman" w:hAnsi="Times New Roman"/>
-                <w:sz w:val="20"/>
-                <w:lang w:val="en-US"/>
-              </w:rPr>
-              <w:t>.p</w:t>
-            </w:r>
-            <w:r>
-              <w:rPr>
-                <w:rFonts w:ascii="Times New Roman" w:hAnsi="Times New Roman"/>
-                <w:sz w:val="20"/>
-              </w:rPr>
-              <w:t>assport}}</w:t>
+              <w:t xml:space="preserve">Паспорт {{owner1.passport}}</w:t>
             </w:r>
           </w:p>
         </w:tc>
@@ -2596,67 +2395,7 @@
                 <w:sz w:val="20"/>
                 <w:lang w:val="ru-RU" w:eastAsia="ru-RU"/>
               </w:rPr>
-              <w:t>Выдан</w:t>
-            </w:r>
-            <w:r>
-              <w:rPr>
-                <w:rFonts w:ascii="Times New Roman" w:hAnsi="Times New Roman"/>
-                <w:color w:val="auto"/>
-                <w:sz w:val="20"/>
-                <w:lang w:val="en-US" w:eastAsia="ru-RU"/>
-              </w:rPr>
-              <w:t xml:space="preserve"> </w:t>
-            </w:r>
-            <w:r>
-              <w:rPr>
-                <w:rFonts w:ascii="Times New Roman" w:hAnsi="Times New Roman"/>
-                <w:sz w:val="20"/>
-              </w:rPr>
-              <w:t>{{seller</w:t>
-            </w:r>
-            <w:r>
-              <w:rPr>
-                <w:rFonts w:ascii="Times New Roman" w:hAnsi="Times New Roman"/>
-                <w:sz w:val="20"/>
-                <w:lang w:val="en-US"/>
-              </w:rPr>
-              <w:t>.</w:t>
-            </w:r>
-            <w:r>
-              <w:rPr>
-                <w:rFonts w:ascii="Times New Roman" w:hAnsi="Times New Roman"/>
-                <w:sz w:val="20"/>
-                <w:lang w:val="en-US"/>
-              </w:rPr>
-              <w:t>passportIssuedByInstrumental</w:t>
-            </w:r>
-            <w:r>
-              <w:rPr>
-                <w:rFonts w:ascii="Times New Roman" w:hAnsi="Times New Roman"/>
-                <w:sz w:val="20"/>
-              </w:rPr>
-              <w:t>}}</w:t>
-            </w:r>
-            <w:r>
-              <w:rPr>
-                <w:rFonts w:ascii="Times New Roman" w:hAnsi="Times New Roman"/>
-                <w:sz w:val="20"/>
-              </w:rPr>
-              <w:t xml:space="preserve"> {{seller.</w:t>
-            </w:r>
-            <w:r>
-              <w:rPr>
-                <w:rFonts w:ascii="Times New Roman" w:hAnsi="Times New Roman"/>
-                <w:sz w:val="20"/>
-              </w:rPr>
-              <w:t>passportIssueDate</w:t>
-            </w:r>
-            <w:r>
-              <w:rPr>
-                <w:rFonts w:ascii="Times New Roman" w:hAnsi="Times New Roman"/>
-                <w:sz w:val="20"/>
-              </w:rPr>
-              <w:t>}}</w:t>
+              <w:t xml:space="preserve">Выдан {{owner1.passportIssuedByInstrumental}} {{owner1.passportIssueDate}}</w:t>
             </w:r>
           </w:p>
         </w:tc>
@@ -2719,38 +2458,7 @@
                 <w:sz w:val="20"/>
                 <w:lang w:val="ru-RU" w:eastAsia="ru-RU"/>
               </w:rPr>
-              <w:t>ИН</w:t>
-            </w:r>
-            <w:r>
-              <w:rPr>
-                <w:rFonts w:ascii="Times New Roman" w:hAnsi="Times New Roman"/>
-                <w:color w:val="auto"/>
-                <w:sz w:val="20"/>
-                <w:lang w:val="en-US" w:eastAsia="ru-RU"/>
-              </w:rPr>
-              <w:t xml:space="preserve"> </w:t>
-            </w:r>
-            <w:r>
-              <w:rPr>
-                <w:rFonts w:ascii="Times New Roman" w:hAnsi="Times New Roman"/>
-                <w:sz w:val="20"/>
-              </w:rPr>
-              <w:t>{{seller</w:t>
-            </w:r>
-            <w:r>
-              <w:rPr>
-                <w:rFonts w:ascii="Times New Roman" w:hAnsi="Times New Roman"/>
-                <w:sz w:val="20"/>
-                <w:lang w:val="en-US"/>
-              </w:rPr>
-              <w:t>.i</w:t>
-            </w:r>
-            <w:r>
-              <w:rPr>
-                <w:rFonts w:ascii="Times New Roman" w:hAnsi="Times New Roman"/>
-                <w:sz w:val="20"/>
-              </w:rPr>
-              <w:t>d}}</w:t>
+              <w:t xml:space="preserve">ИН {{owner1.id}}</w:t>
             </w:r>
           </w:p>
         </w:tc>
@@ -2813,38 +2521,7 @@
                 <w:sz w:val="20"/>
                 <w:lang w:val="ru-RU" w:eastAsia="ru-RU"/>
               </w:rPr>
-              <w:t>Тел.</w:t>
-            </w:r>
-            <w:r>
-              <w:rPr>
-                <w:rFonts w:ascii="Times New Roman" w:hAnsi="Times New Roman"/>
-                <w:color w:val="auto"/>
-                <w:sz w:val="20"/>
-                <w:lang w:val="en-US" w:eastAsia="ru-RU"/>
-              </w:rPr>
-              <w:t xml:space="preserve"> </w:t>
-            </w:r>
-            <w:r>
-              <w:rPr>
-                <w:rFonts w:ascii="Times New Roman" w:hAnsi="Times New Roman"/>
-                <w:sz w:val="20"/>
-              </w:rPr>
-              <w:t>{{seller</w:t>
-            </w:r>
-            <w:r>
-              <w:rPr>
-                <w:rFonts w:ascii="Times New Roman" w:hAnsi="Times New Roman"/>
-                <w:sz w:val="20"/>
-                <w:lang w:val="en-US"/>
-              </w:rPr>
-              <w:t>.p</w:t>
-            </w:r>
-            <w:r>
-              <w:rPr>
-                <w:rFonts w:ascii="Times New Roman" w:hAnsi="Times New Roman"/>
-                <w:sz w:val="20"/>
-              </w:rPr>
-              <w:t>hone}}</w:t>
+              <w:t xml:space="preserve">Тел. {{owner1.phone}}</w:t>
             </w:r>
           </w:p>
         </w:tc>
@@ -2921,43 +2598,321 @@
                 <w:sz w:val="20"/>
                 <w:lang w:val="ru-RU" w:eastAsia="ru-RU"/>
               </w:rPr>
-              <w:t>Подпись                                             /</w:t>
-            </w:r>
-            <w:r>
-              <w:rPr>
-                <w:rFonts w:ascii="Times New Roman" w:hAnsi="Times New Roman"/>
-                <w:color w:val="auto"/>
-                <w:sz w:val="20"/>
-                <w:lang w:val="en-US" w:eastAsia="ru-RU"/>
-              </w:rPr>
-              <w:t xml:space="preserve"> {{seller.</w:t>
-            </w:r>
-            <w:r>
-              <w:rPr>
-                <w:rFonts w:ascii="Times New Roman" w:hAnsi="Times New Roman"/>
-                <w:color w:val="auto"/>
-                <w:sz w:val="20"/>
-                <w:lang w:val="en-US" w:eastAsia="ru-RU"/>
-              </w:rPr>
-              <w:t>initials</w:t>
-            </w:r>
-            <w:r>
-              <w:rPr>
-                <w:rFonts w:ascii="Times New Roman" w:hAnsi="Times New Roman"/>
-                <w:color w:val="auto"/>
-                <w:sz w:val="20"/>
-                <w:lang w:val="en-US" w:eastAsia="ru-RU"/>
-              </w:rPr>
-              <w:t>}}</w:t>
-            </w:r>
-            <w:r>
-              <w:rPr>
-                <w:rFonts w:ascii="Times New Roman" w:hAnsi="Times New Roman"/>
-                <w:color w:val="auto"/>
-                <w:sz w:val="20"/>
-                <w:lang w:val="ru-RU" w:eastAsia="ru-RU"/>
-              </w:rPr>
-              <w:t>/</w:t>
+              <w:t xml:space="preserve">Подпись                                             / {{owner1.signatoryLabel}}/ </w:t>
+            </w:r>
+          </w:p>
+          <w:p>
+            <w:r>
+              <w:t>{#owner2.fullName}</w:t>
+            </w:r>
+          </w:p>
+          <w:p>
+            <w:pPr>
+              <w:autoSpaceDE w:val="0"/>
+              <w:autoSpaceDN w:val="0"/>
+              <w:adjustRightInd w:val="0"/>
+              <w:jc w:val="both"/>
+              <w:rPr>
+                <w:rFonts w:ascii="Times New Roman" w:hAnsi="Times New Roman"/>
+                <w:color w:val="auto"/>
+                <w:sz w:val="20"/>
+              </w:rPr>
+            </w:pPr>
+            <w:r>
+              <w:rPr>
+                <w:rFonts w:ascii="Times New Roman" w:hAnsi="Times New Roman"/>
+                <w:color w:val="auto"/>
+                <w:sz w:val="20"/>
+              </w:rPr>
+              <w:t>{{owner2.fullName}}</w:t>
+            </w:r>
+          </w:p>
+          <w:p>
+            <w:pPr>
+              <w:autoSpaceDE w:val="0"/>
+              <w:autoSpaceDN w:val="0"/>
+              <w:adjustRightInd w:val="0"/>
+              <w:jc w:val="both"/>
+              <w:rPr>
+                <w:rFonts w:ascii="Times New Roman" w:hAnsi="Times New Roman"/>
+                <w:color w:val="auto"/>
+                <w:sz w:val="20"/>
+              </w:rPr>
+            </w:pPr>
+            <w:r>
+              <w:rPr>
+                <w:rFonts w:ascii="Times New Roman" w:hAnsi="Times New Roman"/>
+                <w:color w:val="auto"/>
+                <w:sz w:val="20"/>
+              </w:rPr>
+              <w:t xml:space="preserve">Адрес регистрации: {{owner2.address}}</w:t>
+            </w:r>
+          </w:p>
+          <w:p>
+            <w:pPr>
+              <w:autoSpaceDE w:val="0"/>
+              <w:autoSpaceDN w:val="0"/>
+              <w:adjustRightInd w:val="0"/>
+              <w:jc w:val="both"/>
+              <w:rPr>
+                <w:rFonts w:ascii="Times New Roman" w:hAnsi="Times New Roman"/>
+                <w:color w:val="auto"/>
+                <w:sz w:val="20"/>
+              </w:rPr>
+            </w:pPr>
+            <w:r>
+              <w:rPr>
+                <w:rFonts w:ascii="Times New Roman" w:hAnsi="Times New Roman"/>
+                <w:color w:val="auto"/>
+                <w:sz w:val="20"/>
+              </w:rPr>
+              <w:t xml:space="preserve">Паспорт {{owner2.passport}}</w:t>
+            </w:r>
+          </w:p>
+          <w:p>
+            <w:pPr>
+              <w:autoSpaceDE w:val="0"/>
+              <w:autoSpaceDN w:val="0"/>
+              <w:adjustRightInd w:val="0"/>
+              <w:jc w:val="both"/>
+              <w:rPr>
+                <w:rFonts w:ascii="Times New Roman" w:hAnsi="Times New Roman"/>
+                <w:color w:val="auto"/>
+                <w:sz w:val="20"/>
+              </w:rPr>
+            </w:pPr>
+            <w:r>
+              <w:rPr>
+                <w:rFonts w:ascii="Times New Roman" w:hAnsi="Times New Roman"/>
+                <w:color w:val="auto"/>
+                <w:sz w:val="20"/>
+              </w:rPr>
+              <w:t xml:space="preserve">Выдан {{owner2.passportIssuedByInstrumental}} {{owner2.passportIssueDate}}</w:t>
+            </w:r>
+          </w:p>
+          <w:p>
+            <w:pPr>
+              <w:autoSpaceDE w:val="0"/>
+              <w:autoSpaceDN w:val="0"/>
+              <w:adjustRightInd w:val="0"/>
+              <w:jc w:val="both"/>
+              <w:rPr>
+                <w:rFonts w:ascii="Times New Roman" w:hAnsi="Times New Roman"/>
+                <w:color w:val="auto"/>
+                <w:sz w:val="20"/>
+              </w:rPr>
+            </w:pPr>
+            <w:r>
+              <w:rPr>
+                <w:rFonts w:ascii="Times New Roman" w:hAnsi="Times New Roman"/>
+                <w:color w:val="auto"/>
+                <w:sz w:val="20"/>
+              </w:rPr>
+              <w:t xml:space="preserve">ИН {{owner2.id}}</w:t>
+            </w:r>
+          </w:p>
+          <w:p>
+            <w:pPr>
+              <w:autoSpaceDE w:val="0"/>
+              <w:autoSpaceDN w:val="0"/>
+              <w:adjustRightInd w:val="0"/>
+              <w:jc w:val="both"/>
+              <w:rPr>
+                <w:rFonts w:ascii="Times New Roman" w:hAnsi="Times New Roman"/>
+                <w:color w:val="auto"/>
+                <w:sz w:val="20"/>
+              </w:rPr>
+            </w:pPr>
+            <w:r>
+              <w:rPr>
+                <w:rFonts w:ascii="Times New Roman" w:hAnsi="Times New Roman"/>
+                <w:color w:val="auto"/>
+                <w:sz w:val="20"/>
+              </w:rPr>
+              <w:t xml:space="preserve">Тел. {{owner2.phone}}</w:t>
+            </w:r>
+          </w:p>
+          <w:p>
+            <w:pPr>
+              <w:autoSpaceDE w:val="0"/>
+              <w:autoSpaceDN w:val="0"/>
+              <w:adjustRightInd w:val="0"/>
+              <w:jc w:val="both"/>
+              <w:rPr>
+                <w:rFonts w:ascii="Times New Roman" w:hAnsi="Times New Roman"/>
+                <w:color w:val="auto"/>
+                <w:sz w:val="20"/>
+              </w:rPr>
+            </w:pPr>
+            <w:r>
+              <w:rPr>
+                <w:rFonts w:ascii="Times New Roman" w:hAnsi="Times New Roman"/>
+                <w:color w:val="auto"/>
+                <w:sz w:val="20"/>
+              </w:rPr>
+              <w:t xml:space="preserve">Подпись                                             / {{owner2.signatoryLabel}}/ </w:t>
+            </w:r>
+          </w:p>
+          <w:p>
+            <w:r>
+              <w:t>{/owner2.fullName}</w:t>
+            </w:r>
+          </w:p>
+          <w:p>
+            <w:r>
+              <w:t>{#owner3.fullName}</w:t>
+            </w:r>
+          </w:p>
+          <w:p>
+            <w:pPr>
+              <w:autoSpaceDE w:val="0"/>
+              <w:autoSpaceDN w:val="0"/>
+              <w:adjustRightInd w:val="0"/>
+              <w:jc w:val="both"/>
+              <w:rPr>
+                <w:rFonts w:ascii="Times New Roman" w:hAnsi="Times New Roman"/>
+                <w:color w:val="auto"/>
+                <w:sz w:val="20"/>
+              </w:rPr>
+            </w:pPr>
+            <w:r>
+              <w:rPr>
+                <w:rFonts w:ascii="Times New Roman" w:hAnsi="Times New Roman"/>
+                <w:color w:val="auto"/>
+                <w:sz w:val="20"/>
+              </w:rPr>
+              <w:t>{{owner3.fullName}}</w:t>
+            </w:r>
+          </w:p>
+          <w:p>
+            <w:pPr>
+              <w:autoSpaceDE w:val="0"/>
+              <w:autoSpaceDN w:val="0"/>
+              <w:adjustRightInd w:val="0"/>
+              <w:jc w:val="both"/>
+              <w:rPr>
+                <w:rFonts w:ascii="Times New Roman" w:hAnsi="Times New Roman"/>
+                <w:color w:val="auto"/>
+                <w:sz w:val="20"/>
+              </w:rPr>
+            </w:pPr>
+            <w:r>
+              <w:rPr>
+                <w:rFonts w:ascii="Times New Roman" w:hAnsi="Times New Roman"/>
+                <w:color w:val="auto"/>
+                <w:sz w:val="20"/>
+              </w:rPr>
+              <w:t xml:space="preserve">Адрес регистрации: {{owner3.address}}</w:t>
+            </w:r>
+          </w:p>
+          <w:p>
+            <w:pPr>
+              <w:autoSpaceDE w:val="0"/>
+              <w:autoSpaceDN w:val="0"/>
+              <w:adjustRightInd w:val="0"/>
+              <w:jc w:val="both"/>
+              <w:rPr>
+                <w:rFonts w:ascii="Times New Roman" w:hAnsi="Times New Roman"/>
+                <w:color w:val="auto"/>
+                <w:sz w:val="20"/>
+              </w:rPr>
+            </w:pPr>
+            <w:r>
+              <w:rPr>
+                <w:rFonts w:ascii="Times New Roman" w:hAnsi="Times New Roman"/>
+                <w:color w:val="auto"/>
+                <w:sz w:val="20"/>
+              </w:rPr>
+              <w:t xml:space="preserve">Паспорт {{owner3.passport}}</w:t>
+            </w:r>
+          </w:p>
+          <w:p>
+            <w:pPr>
+              <w:autoSpaceDE w:val="0"/>
+              <w:autoSpaceDN w:val="0"/>
+              <w:adjustRightInd w:val="0"/>
+              <w:jc w:val="both"/>
+              <w:rPr>
+                <w:rFonts w:ascii="Times New Roman" w:hAnsi="Times New Roman"/>
+                <w:color w:val="auto"/>
+                <w:sz w:val="20"/>
+              </w:rPr>
+            </w:pPr>
+            <w:r>
+              <w:rPr>
+                <w:rFonts w:ascii="Times New Roman" w:hAnsi="Times New Roman"/>
+                <w:color w:val="auto"/>
+                <w:sz w:val="20"/>
+              </w:rPr>
+              <w:t xml:space="preserve">Выдан {{owner3.passportIssuedByInstrumental}} {{owner3.passportIssueDate}}</w:t>
+            </w:r>
+          </w:p>
+          <w:p>
+            <w:pPr>
+              <w:autoSpaceDE w:val="0"/>
+              <w:autoSpaceDN w:val="0"/>
+              <w:adjustRightInd w:val="0"/>
+              <w:jc w:val="both"/>
+              <w:rPr>
+                <w:rFonts w:ascii="Times New Roman" w:hAnsi="Times New Roman"/>
+                <w:color w:val="auto"/>
+                <w:sz w:val="20"/>
+              </w:rPr>
+            </w:pPr>
+            <w:r>
+              <w:rPr>
+                <w:rFonts w:ascii="Times New Roman" w:hAnsi="Times New Roman"/>
+                <w:color w:val="auto"/>
+                <w:sz w:val="20"/>
+              </w:rPr>
+              <w:t xml:space="preserve">ИН {{owner3.id}}</w:t>
+            </w:r>
+          </w:p>
+          <w:p>
+            <w:pPr>
+              <w:autoSpaceDE w:val="0"/>
+              <w:autoSpaceDN w:val="0"/>
+              <w:adjustRightInd w:val="0"/>
+              <w:jc w:val="both"/>
+              <w:rPr>
+                <w:rFonts w:ascii="Times New Roman" w:hAnsi="Times New Roman"/>
+                <w:color w:val="auto"/>
+                <w:sz w:val="20"/>
+              </w:rPr>
+            </w:pPr>
+            <w:r>
+              <w:rPr>
+                <w:rFonts w:ascii="Times New Roman" w:hAnsi="Times New Roman"/>
+                <w:color w:val="auto"/>
+                <w:sz w:val="20"/>
+              </w:rPr>
+              <w:t xml:space="preserve">Тел. {{owner3.phone}}</w:t>
+            </w:r>
+          </w:p>
+          <w:p>
+            <w:pPr>
+              <w:autoSpaceDE w:val="0"/>
+              <w:autoSpaceDN w:val="0"/>
+              <w:adjustRightInd w:val="0"/>
+              <w:jc w:val="both"/>
+              <w:rPr>
+                <w:rFonts w:ascii="Times New Roman" w:hAnsi="Times New Roman"/>
+                <w:color w:val="auto"/>
+                <w:sz w:val="20"/>
+              </w:rPr>
+            </w:pPr>
+            <w:r>
+              <w:rPr>
+                <w:rFonts w:ascii="Times New Roman" w:hAnsi="Times New Roman"/>
+                <w:color w:val="auto"/>
+                <w:sz w:val="20"/>
+              </w:rPr>
+              <w:t xml:space="preserve">Подпись                                             / {{owner3.signatoryLabel}}/ </w:t>
+            </w:r>
+          </w:p>
+          <w:p>
+            <w:r>
+              <w:t>{/owner3.fullName}</w:t>
             </w:r>
           </w:p>
         </w:tc>
@@ -5083,42 +5038,147 @@
                 <w:color w:val="auto"/>
                 <w:sz w:val="20"/>
               </w:rPr>
-              <w:t>__________________/</w:t>
-            </w:r>
-            <w:r>
-              <w:rPr>
-                <w:rFonts w:ascii="Times New Roman" w:hAnsi="Times New Roman"/>
-                <w:color w:val="auto"/>
-                <w:sz w:val="20"/>
-                <w:lang w:val="en-US" w:eastAsia="ru-RU"/>
-              </w:rPr>
-              <w:t>{{seller.</w:t>
-            </w:r>
-            <w:r>
-              <w:rPr>
-                <w:rFonts w:ascii="Times New Roman" w:hAnsi="Times New Roman"/>
-                <w:color w:val="auto"/>
-                <w:sz w:val="20"/>
-                <w:lang w:val="en-US" w:eastAsia="ru-RU"/>
-              </w:rPr>
-              <w:t>initials</w:t>
-            </w:r>
-            <w:r>
-              <w:rPr>
-                <w:rFonts w:ascii="Times New Roman" w:hAnsi="Times New Roman"/>
-                <w:color w:val="auto"/>
-                <w:sz w:val="20"/>
-                <w:lang w:val="en-US" w:eastAsia="ru-RU"/>
-              </w:rPr>
-              <w:t>}}</w:t>
-            </w:r>
-            <w:r>
-              <w:rPr>
-                <w:rFonts w:ascii="Times New Roman" w:hAnsi="Times New Roman"/>
-                <w:color w:val="auto"/>
-                <w:sz w:val="20"/>
-              </w:rPr>
-              <w:t xml:space="preserve">     </w:t>
+              <w:t xml:space="preserve">__________________/{{owner1.signatoryLabel}}     </w:t>
+            </w:r>
+          </w:p>
+          <w:p>
+            <w:r>
+              <w:t>{#owner2.fullName}</w:t>
+            </w:r>
+          </w:p>
+          <w:p>
+            <w:pPr>
+              <w:rPr>
+                <w:rFonts w:ascii="Times New Roman" w:hAnsi="Times New Roman"/>
+                <w:color w:val="auto"/>
+                <w:sz w:val="20"/>
+                <w:highlight w:val="white"/>
+              </w:rPr>
+            </w:pPr>
+          </w:p>
+          <w:p>
+            <w:pPr>
+              <w:rPr>
+                <w:rFonts w:ascii="Times New Roman" w:hAnsi="Times New Roman"/>
+                <w:b/>
+                <w:color w:val="auto"/>
+                <w:sz w:val="20"/>
+                <w:highlight w:val="white"/>
+              </w:rPr>
+            </w:pPr>
+            <w:r>
+              <w:rPr>
+                <w:rFonts w:ascii="Times New Roman" w:hAnsi="Times New Roman"/>
+                <w:b/>
+                <w:color w:val="auto"/>
+                <w:sz w:val="20"/>
+                <w:highlight w:val="white"/>
+              </w:rPr>
+              <w:t>Заказчик</w:t>
+            </w:r>
+          </w:p>
+          <w:p>
+            <w:pPr>
+              <w:rPr>
+                <w:rFonts w:ascii="Times New Roman" w:hAnsi="Times New Roman"/>
+                <w:color w:val="auto"/>
+                <w:sz w:val="20"/>
+                <w:highlight w:val="white"/>
+              </w:rPr>
+            </w:pPr>
+          </w:p>
+          <w:p>
+            <w:pPr>
+              <w:rPr>
+                <w:rFonts w:ascii="Times New Roman" w:hAnsi="Times New Roman"/>
+                <w:color w:val="auto"/>
+                <w:sz w:val="20"/>
+                <w:highlight w:val="white"/>
+              </w:rPr>
+            </w:pPr>
+            <w:r>
+              <w:rPr>
+                <w:rFonts w:ascii="Times New Roman" w:hAnsi="Times New Roman"/>
+                <w:color w:val="auto"/>
+                <w:sz w:val="20"/>
+                <w:highlight w:val="white"/>
+              </w:rPr>
+              <w:t xml:space="preserve">__________________/{{owner2.signatoryLabel}}     </w:t>
+            </w:r>
+          </w:p>
+          <w:p>
+            <w:r>
+              <w:t>{/owner2.fullName}</w:t>
+            </w:r>
+          </w:p>
+          <w:p>
+            <w:r>
+              <w:t>{#owner3.fullName}</w:t>
+            </w:r>
+          </w:p>
+          <w:p>
+            <w:pPr>
+              <w:rPr>
+                <w:rFonts w:ascii="Times New Roman" w:hAnsi="Times New Roman"/>
+                <w:color w:val="auto"/>
+                <w:sz w:val="20"/>
+                <w:highlight w:val="white"/>
+              </w:rPr>
+            </w:pPr>
+          </w:p>
+          <w:p>
+            <w:pPr>
+              <w:rPr>
+                <w:rFonts w:ascii="Times New Roman" w:hAnsi="Times New Roman"/>
+                <w:b/>
+                <w:color w:val="auto"/>
+                <w:sz w:val="20"/>
+                <w:highlight w:val="white"/>
+              </w:rPr>
+            </w:pPr>
+            <w:r>
+              <w:rPr>
+                <w:rFonts w:ascii="Times New Roman" w:hAnsi="Times New Roman"/>
+                <w:b/>
+                <w:color w:val="auto"/>
+                <w:sz w:val="20"/>
+                <w:highlight w:val="white"/>
+              </w:rPr>
+              <w:t>Заказчик</w:t>
+            </w:r>
+          </w:p>
+          <w:p>
+            <w:pPr>
+              <w:rPr>
+                <w:rFonts w:ascii="Times New Roman" w:hAnsi="Times New Roman"/>
+                <w:color w:val="auto"/>
+                <w:sz w:val="20"/>
+                <w:highlight w:val="white"/>
+              </w:rPr>
+            </w:pPr>
+          </w:p>
+          <w:p>
+            <w:pPr>
+              <w:rPr>
+                <w:rFonts w:ascii="Times New Roman" w:hAnsi="Times New Roman"/>
+                <w:color w:val="auto"/>
+                <w:sz w:val="20"/>
+                <w:highlight w:val="white"/>
+              </w:rPr>
+            </w:pPr>
+            <w:r>
+              <w:rPr>
+                <w:rFonts w:ascii="Times New Roman" w:hAnsi="Times New Roman"/>
+                <w:color w:val="auto"/>
+                <w:sz w:val="20"/>
+                <w:highlight w:val="white"/>
+              </w:rPr>
+              <w:t xml:space="preserve">__________________/{{owner3.signatoryLabel}}     </w:t>
+            </w:r>
+          </w:p>
+          <w:p>
+            <w:r>
+              <w:t>{/owner3.fullName}</w:t>
             </w:r>
           </w:p>
         </w:tc>

</xml_diff>